<commit_message>
feat: enforce institutional 3-Table Standard for regression analysis across engine, artifacts, and validators
</commit_message>
<xml_diff>
--- a/projects/study_vertical_slice_regression/academic-state/outputs/06_hypothesis_1_regression.docx
+++ b/projects/study_vertical_slice_regression/academic-state/outputs/06_hypothesis_1_regression.docx
@@ -31,7 +31,7 @@
           <w:rFonts w:ascii="B Titr" w:hAnsi="B Titr" w:cs="B Titr"/>
           <w:rtl/>
         </w:rPr>
-        <w:t>۱. بیان فرضیه و صورت‌بندی مدل</w:t>
+        <w:t>۱. بیان فرضیه و صورت‌بندی مدل پژوهش</w:t>
       </w:r>
     </w:p>
     <w:p>
@@ -48,7 +48,7 @@
           <w:rFonts w:ascii="B Nazanin" w:hAnsi="B Nazanin" w:cs="B Nazanin"/>
           <w:rtl/>
         </w:rPr>
-        <w:t>فرضیه اول پژوهش بیان می‌دارد که «استرس شغلی و انعطاف‌پذیری روان‌شناختی به طور همزمان فرسودگی شغلی کارکنان را پیش‌بینی می‌کنند». به منظور ارزیابی سهم نسبی هر یک از متغیرهای پیش‌بین در تبیین واریانس متغیر ملاک، از الگوی رگرسیون خطی چندگانه به روش همزمان (Enter) استفاده شد.</w:t>
+        <w:t>فرضیه اول پژوهش بیان می‌دارد که «استرس شغلی و انعطاف‌پذیری روان‌شناختی به طور همزمان فرسودگی شغلی کارکنان را پیش‌بینی می‌کنند». به منظور آزمون این فرضیه و تعیین سهم واریانس تبیین‌شده متغیر ملاک توسط متغیرهای پیش‌بین، از الگوی رگرسیون خطی چندگانه به شیوه همزمان (Enter) استفاده شد. پیش از انجام تحلیل، رعایت کامل استاندارد سه‌جدولی آزمون فرضیات رابطه‌ای در دستور کار قرار گرفت.</w:t>
       </w:r>
     </w:p>
     <w:p>
@@ -64,7 +64,7 @@
           <w:rFonts w:ascii="B Titr" w:hAnsi="B Titr" w:cs="B Titr"/>
           <w:rtl/>
         </w:rPr>
-        <w:t>۲. بررسی مفروضه‌های آماری رگرسیون</w:t>
+        <w:t>۲. تحلیل همبستگی‌های دو متغیره و مشخصه‌های توصیفی</w:t>
       </w:r>
     </w:p>
     <w:p>
@@ -81,7 +81,7 @@
           <w:rFonts w:ascii="B Nazanin" w:hAnsi="B Nazanin" w:cs="B Nazanin"/>
           <w:rtl/>
         </w:rPr>
-        <w:t>پیش از اجرای تحلیل رگرسیون، پیش‌شرط‌های اساسی شامل نرمال بودن توزیع خطاهای برآورد، خطی بودن رابطه متغیرها و عدم هم‌خطی چندگانه مورد ارزیابی قرار گرفت. شاخص‌های چولگی و کشیدگی متغیرها در محدوده استاندارد (بین ۱- تا ۱+) قرار داشت که نشان‌دهنده برقراری فرض توزیع نرمال است. همچنین، شاخص عامل تورم واریانس (VIF) برای هر دو متغیر پیش‌بین برابر با ۱.۰۹ و شاخص رواداری (Tolerance) برابر با ۰.۹۲ محاسبه شد که حاکی از فقدان هم‌خطی چندگانه بحرانی میان متغیرهای پیش‌بین است.</w:t>
+        <w:t>نخستین گام در تحلیل رگرسیون، بررسی همبستگی‌های مرتبه صفر پیرسون میان متغیرهای پیش‌بین و متغیر ملاک به منظور ارزیابی روابط خطی اولیه و وارسی هم‌خطی شدید است. در جدول ۱، مقادیر میانگین، انحراف استاندارد و ماتریس همبستگی پیرسون بین متغیرهای پژوهش گزارش شده است.</w:t>
       </w:r>
     </w:p>
     <w:p>
@@ -91,13 +91,487 @@
       </w:pPr>
       <w:r>
         <w:rPr>
-          <w:rFonts w:ascii="B Titr" w:hAnsi="B Titr"/>
+          <w:rFonts w:ascii="B Nazanin" w:hAnsi="B Nazanin"/>
           <w:b/>
-          <w:sz w:val="26"/>
-          <w:rFonts w:ascii="B Titr" w:hAnsi="B Titr" w:cs="B Titr"/>
-          <w:rtl/>
+          <w:sz w:val="22"/>
         </w:rPr>
-        <w:t>۳. یافته‌های استنباطی رگرسیون چندگانه</w:t>
+        <w:t>جدول ۱. ماتریس همبستگی پیرسون و شاخص‌های توصیفی متغیرهای پژوهش (۱۰۰ = N)</w:t>
+      </w:r>
+    </w:p>
+    <w:tbl>
+      <w:tblPr>
+        <w:tblW w:type="auto" w:w="0"/>
+        <w:jc w:val="center"/>
+        <w:tblLook w:firstColumn="1" w:firstRow="1" w:lastColumn="0" w:lastRow="0" w:noHBand="0" w:noVBand="1" w:val="04A0"/>
+        <w:bidiVisual/>
+      </w:tblPr>
+      <w:tblGrid>
+        <w:gridCol w:w="1440"/>
+        <w:gridCol w:w="1440"/>
+        <w:gridCol w:w="1440"/>
+        <w:gridCol w:w="1440"/>
+        <w:gridCol w:w="1440"/>
+        <w:gridCol w:w="1440"/>
+      </w:tblGrid>
+      <w:tr>
+        <w:tc>
+          <w:tcPr>
+            <w:tcW w:type="dxa" w:w="1440"/>
+          </w:tcPr>
+          <w:p>
+            <w:pPr>
+              <w:bidi/>
+              <w:jc w:val="center"/>
+            </w:pPr>
+            <w:r>
+              <w:rPr>
+                <w:rFonts w:ascii="B Nazanin" w:hAnsi="B Nazanin"/>
+                <w:b/>
+                <w:sz w:val="20"/>
+              </w:rPr>
+              <w:t>متغیرها</w:t>
+            </w:r>
+          </w:p>
+        </w:tc>
+        <w:tc>
+          <w:tcPr>
+            <w:tcW w:type="dxa" w:w="1440"/>
+          </w:tcPr>
+          <w:p>
+            <w:pPr>
+              <w:bidi/>
+              <w:jc w:val="center"/>
+            </w:pPr>
+            <w:r>
+              <w:rPr>
+                <w:rFonts w:ascii="B Nazanin" w:hAnsi="B Nazanin"/>
+                <w:b/>
+                <w:sz w:val="20"/>
+              </w:rPr>
+              <w:t>میانگین</w:t>
+            </w:r>
+          </w:p>
+        </w:tc>
+        <w:tc>
+          <w:tcPr>
+            <w:tcW w:type="dxa" w:w="1440"/>
+          </w:tcPr>
+          <w:p>
+            <w:pPr>
+              <w:bidi/>
+              <w:jc w:val="center"/>
+            </w:pPr>
+            <w:r>
+              <w:rPr>
+                <w:rFonts w:ascii="B Nazanin" w:hAnsi="B Nazanin"/>
+                <w:b/>
+                <w:sz w:val="20"/>
+              </w:rPr>
+              <w:t>انحراف استاندارد</w:t>
+            </w:r>
+          </w:p>
+        </w:tc>
+        <w:tc>
+          <w:tcPr>
+            <w:tcW w:type="dxa" w:w="1440"/>
+          </w:tcPr>
+          <w:p>
+            <w:pPr>
+              <w:bidi/>
+              <w:jc w:val="center"/>
+            </w:pPr>
+            <w:r>
+              <w:rPr>
+                <w:rFonts w:ascii="B Nazanin" w:hAnsi="B Nazanin"/>
+                <w:b/>
+                <w:sz w:val="20"/>
+              </w:rPr>
+              <w:t>۱</w:t>
+            </w:r>
+          </w:p>
+        </w:tc>
+        <w:tc>
+          <w:tcPr>
+            <w:tcW w:type="dxa" w:w="1440"/>
+          </w:tcPr>
+          <w:p>
+            <w:pPr>
+              <w:bidi/>
+              <w:jc w:val="center"/>
+            </w:pPr>
+            <w:r>
+              <w:rPr>
+                <w:rFonts w:ascii="B Nazanin" w:hAnsi="B Nazanin"/>
+                <w:b/>
+                <w:sz w:val="20"/>
+              </w:rPr>
+              <w:t>۲</w:t>
+            </w:r>
+          </w:p>
+        </w:tc>
+        <w:tc>
+          <w:tcPr>
+            <w:tcW w:type="dxa" w:w="1440"/>
+          </w:tcPr>
+          <w:p>
+            <w:pPr>
+              <w:bidi/>
+              <w:jc w:val="center"/>
+            </w:pPr>
+            <w:r>
+              <w:rPr>
+                <w:rFonts w:ascii="B Nazanin" w:hAnsi="B Nazanin"/>
+                <w:b/>
+                <w:sz w:val="20"/>
+              </w:rPr>
+              <w:t>۳</w:t>
+            </w:r>
+          </w:p>
+        </w:tc>
+      </w:tr>
+      <w:tr>
+        <w:tc>
+          <w:tcPr>
+            <w:tcW w:type="dxa" w:w="1440"/>
+          </w:tcPr>
+          <w:p>
+            <w:pPr>
+              <w:bidi/>
+              <w:jc w:val="center"/>
+            </w:pPr>
+            <w:r>
+              <w:rPr>
+                <w:rFonts w:ascii="Times New Roman" w:hAnsi="Times New Roman"/>
+                <w:sz w:val="20"/>
+              </w:rPr>
+              <w:t>۱. فرسودگی شغلی</w:t>
+            </w:r>
+          </w:p>
+        </w:tc>
+        <w:tc>
+          <w:tcPr>
+            <w:tcW w:type="dxa" w:w="1440"/>
+          </w:tcPr>
+          <w:p>
+            <w:pPr>
+              <w:bidi/>
+              <w:jc w:val="center"/>
+            </w:pPr>
+            <w:r>
+              <w:rPr>
+                <w:rFonts w:ascii="Times New Roman" w:hAnsi="Times New Roman"/>
+                <w:sz w:val="20"/>
+              </w:rPr>
+              <w:t>۳.۱۷</w:t>
+            </w:r>
+          </w:p>
+        </w:tc>
+        <w:tc>
+          <w:tcPr>
+            <w:tcW w:type="dxa" w:w="1440"/>
+          </w:tcPr>
+          <w:p>
+            <w:pPr>
+              <w:bidi/>
+              <w:jc w:val="center"/>
+            </w:pPr>
+            <w:r>
+              <w:rPr>
+                <w:rFonts w:ascii="Times New Roman" w:hAnsi="Times New Roman"/>
+                <w:sz w:val="20"/>
+              </w:rPr>
+              <w:t>۰.۶۷</w:t>
+            </w:r>
+          </w:p>
+        </w:tc>
+        <w:tc>
+          <w:tcPr>
+            <w:tcW w:type="dxa" w:w="1440"/>
+          </w:tcPr>
+          <w:p>
+            <w:pPr>
+              <w:bidi/>
+              <w:jc w:val="center"/>
+            </w:pPr>
+            <w:r>
+              <w:rPr>
+                <w:rFonts w:ascii="Times New Roman" w:hAnsi="Times New Roman"/>
+                <w:sz w:val="20"/>
+              </w:rPr>
+              <w:t>۱</w:t>
+            </w:r>
+          </w:p>
+        </w:tc>
+        <w:tc>
+          <w:tcPr>
+            <w:tcW w:type="dxa" w:w="1440"/>
+          </w:tcPr>
+          <w:p>
+            <w:pPr>
+              <w:bidi/>
+              <w:jc w:val="center"/>
+            </w:pPr>
+            <w:r>
+              <w:rPr>
+                <w:rFonts w:ascii="B Nazanin" w:hAnsi="B Nazanin"/>
+                <w:sz w:val="20"/>
+              </w:rPr>
+              <w:t>—</w:t>
+            </w:r>
+          </w:p>
+        </w:tc>
+        <w:tc>
+          <w:tcPr>
+            <w:tcW w:type="dxa" w:w="1440"/>
+          </w:tcPr>
+          <w:p>
+            <w:pPr>
+              <w:bidi/>
+              <w:jc w:val="center"/>
+            </w:pPr>
+            <w:r>
+              <w:rPr>
+                <w:rFonts w:ascii="B Nazanin" w:hAnsi="B Nazanin"/>
+                <w:sz w:val="20"/>
+              </w:rPr>
+              <w:t>—</w:t>
+            </w:r>
+          </w:p>
+        </w:tc>
+      </w:tr>
+      <w:tr>
+        <w:tc>
+          <w:tcPr>
+            <w:tcW w:type="dxa" w:w="1440"/>
+          </w:tcPr>
+          <w:p>
+            <w:pPr>
+              <w:bidi/>
+              <w:jc w:val="center"/>
+            </w:pPr>
+            <w:r>
+              <w:rPr>
+                <w:rFonts w:ascii="Times New Roman" w:hAnsi="Times New Roman"/>
+                <w:sz w:val="20"/>
+              </w:rPr>
+              <w:t>۲. استرس شغلی</w:t>
+            </w:r>
+          </w:p>
+        </w:tc>
+        <w:tc>
+          <w:tcPr>
+            <w:tcW w:type="dxa" w:w="1440"/>
+          </w:tcPr>
+          <w:p>
+            <w:pPr>
+              <w:bidi/>
+              <w:jc w:val="center"/>
+            </w:pPr>
+            <w:r>
+              <w:rPr>
+                <w:rFonts w:ascii="Times New Roman" w:hAnsi="Times New Roman"/>
+                <w:sz w:val="20"/>
+              </w:rPr>
+              <w:t>۳.۳۶</w:t>
+            </w:r>
+          </w:p>
+        </w:tc>
+        <w:tc>
+          <w:tcPr>
+            <w:tcW w:type="dxa" w:w="1440"/>
+          </w:tcPr>
+          <w:p>
+            <w:pPr>
+              <w:bidi/>
+              <w:jc w:val="center"/>
+            </w:pPr>
+            <w:r>
+              <w:rPr>
+                <w:rFonts w:ascii="Times New Roman" w:hAnsi="Times New Roman"/>
+                <w:sz w:val="20"/>
+              </w:rPr>
+              <w:t>۰.۶۷</w:t>
+            </w:r>
+          </w:p>
+        </w:tc>
+        <w:tc>
+          <w:tcPr>
+            <w:tcW w:type="dxa" w:w="1440"/>
+          </w:tcPr>
+          <w:p>
+            <w:pPr>
+              <w:bidi/>
+              <w:jc w:val="center"/>
+            </w:pPr>
+            <w:r>
+              <w:rPr>
+                <w:rFonts w:ascii="Times New Roman" w:hAnsi="Times New Roman"/>
+                <w:sz w:val="20"/>
+              </w:rPr>
+              <w:t>۰.۵۵***</w:t>
+            </w:r>
+          </w:p>
+        </w:tc>
+        <w:tc>
+          <w:tcPr>
+            <w:tcW w:type="dxa" w:w="1440"/>
+          </w:tcPr>
+          <w:p>
+            <w:pPr>
+              <w:bidi/>
+              <w:jc w:val="center"/>
+            </w:pPr>
+            <w:r>
+              <w:rPr>
+                <w:rFonts w:ascii="Times New Roman" w:hAnsi="Times New Roman"/>
+                <w:sz w:val="20"/>
+              </w:rPr>
+              <w:t>۱</w:t>
+            </w:r>
+          </w:p>
+        </w:tc>
+        <w:tc>
+          <w:tcPr>
+            <w:tcW w:type="dxa" w:w="1440"/>
+          </w:tcPr>
+          <w:p>
+            <w:pPr>
+              <w:bidi/>
+              <w:jc w:val="center"/>
+            </w:pPr>
+            <w:r>
+              <w:rPr>
+                <w:rFonts w:ascii="B Nazanin" w:hAnsi="B Nazanin"/>
+                <w:sz w:val="20"/>
+              </w:rPr>
+              <w:t>—</w:t>
+            </w:r>
+          </w:p>
+        </w:tc>
+      </w:tr>
+      <w:tr>
+        <w:tc>
+          <w:tcPr>
+            <w:tcW w:type="dxa" w:w="1440"/>
+          </w:tcPr>
+          <w:p>
+            <w:pPr>
+              <w:bidi/>
+              <w:jc w:val="center"/>
+            </w:pPr>
+            <w:r>
+              <w:rPr>
+                <w:rFonts w:ascii="Times New Roman" w:hAnsi="Times New Roman"/>
+                <w:sz w:val="20"/>
+              </w:rPr>
+              <w:t>۳. انعطاف‌پذیری روان‌شناختی</w:t>
+            </w:r>
+          </w:p>
+        </w:tc>
+        <w:tc>
+          <w:tcPr>
+            <w:tcW w:type="dxa" w:w="1440"/>
+          </w:tcPr>
+          <w:p>
+            <w:pPr>
+              <w:bidi/>
+              <w:jc w:val="center"/>
+            </w:pPr>
+            <w:r>
+              <w:rPr>
+                <w:rFonts w:ascii="Times New Roman" w:hAnsi="Times New Roman"/>
+                <w:sz w:val="20"/>
+              </w:rPr>
+              <w:t>۳.۳۶</w:t>
+            </w:r>
+          </w:p>
+        </w:tc>
+        <w:tc>
+          <w:tcPr>
+            <w:tcW w:type="dxa" w:w="1440"/>
+          </w:tcPr>
+          <w:p>
+            <w:pPr>
+              <w:bidi/>
+              <w:jc w:val="center"/>
+            </w:pPr>
+            <w:r>
+              <w:rPr>
+                <w:rFonts w:ascii="Times New Roman" w:hAnsi="Times New Roman"/>
+                <w:sz w:val="20"/>
+              </w:rPr>
+              <w:t>۰.۶۳</w:t>
+            </w:r>
+          </w:p>
+        </w:tc>
+        <w:tc>
+          <w:tcPr>
+            <w:tcW w:type="dxa" w:w="1440"/>
+          </w:tcPr>
+          <w:p>
+            <w:pPr>
+              <w:bidi/>
+              <w:jc w:val="center"/>
+            </w:pPr>
+            <w:r>
+              <w:rPr>
+                <w:rFonts w:ascii="Times New Roman" w:hAnsi="Times New Roman"/>
+                <w:sz w:val="20"/>
+              </w:rPr>
+              <w:t>۰.۴۶-***</w:t>
+            </w:r>
+          </w:p>
+        </w:tc>
+        <w:tc>
+          <w:tcPr>
+            <w:tcW w:type="dxa" w:w="1440"/>
+          </w:tcPr>
+          <w:p>
+            <w:pPr>
+              <w:bidi/>
+              <w:jc w:val="center"/>
+            </w:pPr>
+            <w:r>
+              <w:rPr>
+                <w:rFonts w:ascii="Times New Roman" w:hAnsi="Times New Roman"/>
+                <w:sz w:val="20"/>
+              </w:rPr>
+              <w:t>۰.۲۷-**</w:t>
+            </w:r>
+          </w:p>
+        </w:tc>
+        <w:tc>
+          <w:tcPr>
+            <w:tcW w:type="dxa" w:w="1440"/>
+          </w:tcPr>
+          <w:p>
+            <w:pPr>
+              <w:bidi/>
+              <w:jc w:val="center"/>
+            </w:pPr>
+            <w:r>
+              <w:rPr>
+                <w:rFonts w:ascii="Times New Roman" w:hAnsi="Times New Roman"/>
+                <w:sz w:val="20"/>
+              </w:rPr>
+              <w:t>۱</w:t>
+            </w:r>
+          </w:p>
+        </w:tc>
+      </w:tr>
+    </w:tbl>
+    <w:p>
+      <w:pPr>
+        <w:bidi/>
+        <w:jc w:val="both"/>
+      </w:pPr>
+      <w:r>
+        <w:rPr>
+          <w:rFonts w:ascii="B Nazanin" w:hAnsi="B Nazanin"/>
+          <w:i/>
+          <w:sz w:val="20"/>
+        </w:rPr>
+        <w:t>یادداشت. ۰.۰۱ &gt; **p، ۰.۰۰۱ &gt; ***p.</w:t>
       </w:r>
     </w:p>
     <w:p>
@@ -114,7 +588,40 @@
           <w:rFonts w:ascii="B Nazanin" w:hAnsi="B Nazanin" w:cs="B Nazanin"/>
           <w:rtl/>
         </w:rPr>
-        <w:t>خلاصه مشخصه‌های آماری مدل رگرسیون و ضرایب استاندارد و غیراستاندارد متغیرهای پیش‌بین در جدول ۱ گزارش شده است.</w:t>
+        <w:t>همان‌گونه که در جدول ۱ مشاهده می‌شود، استرس شغلی با فرسودگی شغلی دارای همبستگی مثبت و معنادار (۰.۰۰۱ &gt; p ،۰.۵۵ = r) است. در مقابل، انعطاف‌پذیری روان‌شناختی با فرسودگی شغلی رابطه منفی و معناداری نشان می‌دهد (۰.۰۰۱ &gt; p ،۰.۴۶- = r). همچنین همبستگی میان دو متغیر پیش‌بین برابر با ۰.۲۷- محاسبه شد که نشان‌دهنده استقلال مفهومی سازه‌ها و عدم هم‌پوشانی هم‌خطی چندگانه بحرانی میان آن‌هاست.</w:t>
+      </w:r>
+    </w:p>
+    <w:p>
+      <w:pPr>
+        <w:bidi/>
+        <w:jc w:val="right"/>
+      </w:pPr>
+      <w:r>
+        <w:rPr>
+          <w:rFonts w:ascii="B Titr" w:hAnsi="B Titr"/>
+          <w:b/>
+          <w:sz w:val="26"/>
+          <w:rFonts w:ascii="B Titr" w:hAnsi="B Titr" w:cs="B Titr"/>
+          <w:rtl/>
+        </w:rPr>
+        <w:t>۳. خلاصه مدل رگرسیون و تحلیل واریانس (ANOVA)</w:t>
+      </w:r>
+    </w:p>
+    <w:p>
+      <w:pPr>
+        <w:bidi/>
+        <w:jc w:val="both"/>
+      </w:pPr>
+      <w:r>
+        <w:rPr>
+          <w:rFonts w:ascii="B Nazanin" w:hAnsi="B Nazanin"/>
+          <w:b w:val="0"/>
+          <w:i w:val="0"/>
+          <w:sz w:val="26"/>
+          <w:rFonts w:ascii="B Nazanin" w:hAnsi="B Nazanin" w:cs="B Nazanin"/>
+          <w:rtl/>
+        </w:rPr>
+        <w:t>به منظور بررسی معناداری کلی مدل رگرسیون و تعیین نسبت واریانس تبیین‌شده فرسودگی شغلی توسط دو متغیر پیش‌بین، آزمون تحلیل واریانس رگرسیون محاسبه شد. جدول ۲ خلاصه مدل رگرسیون و نتایج تحلیل واریانس را نشان می‌دهد.</w:t>
       </w:r>
     </w:p>
     <w:p>
@@ -128,7 +635,7 @@
           <w:b/>
           <w:sz w:val="22"/>
         </w:rPr>
-        <w:t>جدول ۱. ضرایب رگرسیون چندگانه پیش‌بینی فرسودگی شغلی بر اساس استرس شغلی و انعطاف‌پذیری روان‌شناختی (۱۰۰ = N)</w:t>
+        <w:t>جدول ۲. خلاصه مدل رگرسیون چندگانه و تحلیل واریانس (ANOVA) پیش‌بینی فرسودگی شغلی (۱۰۰ = N)</w:t>
       </w:r>
     </w:p>
     <w:tbl>
@@ -139,18 +646,22 @@
         <w:bidiVisual/>
       </w:tblPr>
       <w:tblGrid>
-        <w:gridCol w:w="1234"/>
-        <w:gridCol w:w="1234"/>
-        <w:gridCol w:w="1234"/>
-        <w:gridCol w:w="1234"/>
-        <w:gridCol w:w="1234"/>
-        <w:gridCol w:w="1234"/>
-        <w:gridCol w:w="1234"/>
+        <w:gridCol w:w="785"/>
+        <w:gridCol w:w="785"/>
+        <w:gridCol w:w="785"/>
+        <w:gridCol w:w="785"/>
+        <w:gridCol w:w="785"/>
+        <w:gridCol w:w="785"/>
+        <w:gridCol w:w="785"/>
+        <w:gridCol w:w="785"/>
+        <w:gridCol w:w="785"/>
+        <w:gridCol w:w="785"/>
+        <w:gridCol w:w="785"/>
       </w:tblGrid>
       <w:tr>
         <w:tc>
           <w:tcPr>
-            <w:tcW w:type="dxa" w:w="1234"/>
+            <w:tcW w:type="dxa" w:w="785"/>
           </w:tcPr>
           <w:p>
             <w:pPr>
@@ -161,15 +672,15 @@
               <w:rPr>
                 <w:rFonts w:ascii="B Nazanin" w:hAnsi="B Nazanin"/>
                 <w:b/>
-                <w:sz w:val="22"/>
+                <w:sz w:val="20"/>
               </w:rPr>
-              <w:t>متغیر پیش‌بین</w:t>
+              <w:t>منبع تغییرات</w:t>
             </w:r>
           </w:p>
         </w:tc>
         <w:tc>
           <w:tcPr>
-            <w:tcW w:type="dxa" w:w="1234"/>
+            <w:tcW w:type="dxa" w:w="785"/>
           </w:tcPr>
           <w:p>
             <w:pPr>
@@ -180,15 +691,15 @@
               <w:rPr>
                 <w:rFonts w:ascii="B Nazanin" w:hAnsi="B Nazanin"/>
                 <w:b/>
-                <w:sz w:val="22"/>
+                <w:sz w:val="20"/>
               </w:rPr>
-              <w:t>B</w:t>
+              <w:t>مجموع مجذورات (SS)</w:t>
             </w:r>
           </w:p>
         </w:tc>
         <w:tc>
           <w:tcPr>
-            <w:tcW w:type="dxa" w:w="1234"/>
+            <w:tcW w:type="dxa" w:w="785"/>
           </w:tcPr>
           <w:p>
             <w:pPr>
@@ -199,15 +710,15 @@
               <w:rPr>
                 <w:rFonts w:ascii="B Nazanin" w:hAnsi="B Nazanin"/>
                 <w:b/>
-                <w:sz w:val="22"/>
+                <w:sz w:val="20"/>
               </w:rPr>
-              <w:t>SE</w:t>
+              <w:t>درجه آزادی (df)</w:t>
             </w:r>
           </w:p>
         </w:tc>
         <w:tc>
           <w:tcPr>
-            <w:tcW w:type="dxa" w:w="1234"/>
+            <w:tcW w:type="dxa" w:w="785"/>
           </w:tcPr>
           <w:p>
             <w:pPr>
@@ -218,15 +729,15 @@
               <w:rPr>
                 <w:rFonts w:ascii="B Nazanin" w:hAnsi="B Nazanin"/>
                 <w:b/>
-                <w:sz w:val="22"/>
+                <w:sz w:val="20"/>
               </w:rPr>
-              <w:t>β</w:t>
+              <w:t>میانگین مجذورات (MS)</w:t>
             </w:r>
           </w:p>
         </w:tc>
         <w:tc>
           <w:tcPr>
-            <w:tcW w:type="dxa" w:w="1234"/>
+            <w:tcW w:type="dxa" w:w="785"/>
           </w:tcPr>
           <w:p>
             <w:pPr>
@@ -237,15 +748,15 @@
               <w:rPr>
                 <w:rFonts w:ascii="B Nazanin" w:hAnsi="B Nazanin"/>
                 <w:b/>
-                <w:sz w:val="22"/>
+                <w:sz w:val="20"/>
               </w:rPr>
-              <w:t>t</w:t>
+              <w:t>F</w:t>
             </w:r>
           </w:p>
         </w:tc>
         <w:tc>
           <w:tcPr>
-            <w:tcW w:type="dxa" w:w="1234"/>
+            <w:tcW w:type="dxa" w:w="785"/>
           </w:tcPr>
           <w:p>
             <w:pPr>
@@ -256,15 +767,15 @@
               <w:rPr>
                 <w:rFonts w:ascii="B Nazanin" w:hAnsi="B Nazanin"/>
                 <w:b/>
-                <w:sz w:val="22"/>
+                <w:sz w:val="20"/>
               </w:rPr>
-              <w:t>سطح معناداری</w:t>
+              <w:t>سطح معناداری (p)</w:t>
             </w:r>
           </w:p>
         </w:tc>
         <w:tc>
           <w:tcPr>
-            <w:tcW w:type="dxa" w:w="1234"/>
+            <w:tcW w:type="dxa" w:w="785"/>
           </w:tcPr>
           <w:p>
             <w:pPr>
@@ -275,17 +786,15 @@
               <w:rPr>
                 <w:rFonts w:ascii="B Nazanin" w:hAnsi="B Nazanin"/>
                 <w:b/>
-                <w:sz w:val="22"/>
+                <w:sz w:val="20"/>
               </w:rPr>
-              <w:t>VIF</w:t>
+              <w:t>R</w:t>
             </w:r>
           </w:p>
         </w:tc>
-      </w:tr>
-      <w:tr>
         <w:tc>
           <w:tcPr>
-            <w:tcW w:type="dxa" w:w="1234"/>
+            <w:tcW w:type="dxa" w:w="785"/>
           </w:tcPr>
           <w:p>
             <w:pPr>
@@ -295,15 +804,93 @@
             <w:r>
               <w:rPr>
                 <w:rFonts w:ascii="B Nazanin" w:hAnsi="B Nazanin"/>
-                <w:sz w:val="22"/>
+                <w:b/>
+                <w:sz w:val="20"/>
               </w:rPr>
-              <w:t>مقدار ثابت</w:t>
+              <w:t>R²</w:t>
             </w:r>
           </w:p>
         </w:tc>
         <w:tc>
           <w:tcPr>
-            <w:tcW w:type="dxa" w:w="1234"/>
+            <w:tcW w:type="dxa" w:w="785"/>
+          </w:tcPr>
+          <w:p>
+            <w:pPr>
+              <w:bidi/>
+              <w:jc w:val="center"/>
+            </w:pPr>
+            <w:r>
+              <w:rPr>
+                <w:rFonts w:ascii="B Nazanin" w:hAnsi="B Nazanin"/>
+                <w:b/>
+                <w:sz w:val="20"/>
+              </w:rPr>
+              <w:t>R² تعدیل‌شده</w:t>
+            </w:r>
+          </w:p>
+        </w:tc>
+        <w:tc>
+          <w:tcPr>
+            <w:tcW w:type="dxa" w:w="785"/>
+          </w:tcPr>
+          <w:p>
+            <w:pPr>
+              <w:bidi/>
+              <w:jc w:val="center"/>
+            </w:pPr>
+            <w:r>
+              <w:rPr>
+                <w:rFonts w:ascii="B Nazanin" w:hAnsi="B Nazanin"/>
+                <w:b/>
+                <w:sz w:val="20"/>
+              </w:rPr>
+              <w:t>خطای معیار</w:t>
+            </w:r>
+          </w:p>
+        </w:tc>
+        <w:tc>
+          <w:tcPr>
+            <w:tcW w:type="dxa" w:w="785"/>
+          </w:tcPr>
+          <w:p>
+            <w:pPr>
+              <w:bidi/>
+              <w:jc w:val="center"/>
+            </w:pPr>
+            <w:r>
+              <w:rPr>
+                <w:rFonts w:ascii="B Nazanin" w:hAnsi="B Nazanin"/>
+                <w:b/>
+                <w:sz w:val="20"/>
+              </w:rPr>
+              <w:t>دوربین-واتسون</w:t>
+            </w:r>
+          </w:p>
+        </w:tc>
+      </w:tr>
+      <w:tr>
+        <w:tc>
+          <w:tcPr>
+            <w:tcW w:type="dxa" w:w="785"/>
+          </w:tcPr>
+          <w:p>
+            <w:pPr>
+              <w:bidi/>
+              <w:jc w:val="center"/>
+            </w:pPr>
+            <w:r>
+              <w:rPr>
+                <w:rFonts w:ascii="B Nazanin" w:hAnsi="B Nazanin"/>
+                <w:sz w:val="20"/>
+              </w:rPr>
+              <w:t>رگرسیون</w:t>
+            </w:r>
+          </w:p>
+        </w:tc>
+        <w:tc>
+          <w:tcPr>
+            <w:tcW w:type="dxa" w:w="785"/>
           </w:tcPr>
           <w:p>
             <w:pPr>
@@ -313,15 +900,15 @@
             <w:r>
               <w:rPr>
                 <w:rFonts w:ascii="Times New Roman" w:hAnsi="Times New Roman"/>
-                <w:sz w:val="22"/>
+                <w:sz w:val="20"/>
               </w:rPr>
-              <w:t>۲.۳۱۴</w:t>
+              <w:t>۱۸.۷۰۸</w:t>
             </w:r>
           </w:p>
         </w:tc>
         <w:tc>
           <w:tcPr>
-            <w:tcW w:type="dxa" w:w="1234"/>
+            <w:tcW w:type="dxa" w:w="785"/>
           </w:tcPr>
           <w:p>
             <w:pPr>
@@ -331,15 +918,161 @@
             <w:r>
               <w:rPr>
                 <w:rFonts w:ascii="Times New Roman" w:hAnsi="Times New Roman"/>
-                <w:sz w:val="22"/>
+                <w:sz w:val="20"/>
               </w:rPr>
-              <w:t>۰.۳۵۲</w:t>
+              <w:t>۲</w:t>
             </w:r>
           </w:p>
         </w:tc>
         <w:tc>
           <w:tcPr>
-            <w:tcW w:type="dxa" w:w="1234"/>
+            <w:tcW w:type="dxa" w:w="785"/>
+          </w:tcPr>
+          <w:p>
+            <w:pPr>
+              <w:bidi/>
+              <w:jc w:val="center"/>
+            </w:pPr>
+            <w:r>
+              <w:rPr>
+                <w:rFonts w:ascii="Times New Roman" w:hAnsi="Times New Roman"/>
+                <w:sz w:val="20"/>
+              </w:rPr>
+              <w:t>۹.۳۵۴</w:t>
+            </w:r>
+          </w:p>
+        </w:tc>
+        <w:tc>
+          <w:tcPr>
+            <w:tcW w:type="dxa" w:w="785"/>
+          </w:tcPr>
+          <w:p>
+            <w:pPr>
+              <w:bidi/>
+              <w:jc w:val="center"/>
+            </w:pPr>
+            <w:r>
+              <w:rPr>
+                <w:rFonts w:ascii="Times New Roman" w:hAnsi="Times New Roman"/>
+                <w:sz w:val="20"/>
+              </w:rPr>
+              <w:t>34.389</w:t>
+            </w:r>
+          </w:p>
+        </w:tc>
+        <w:tc>
+          <w:tcPr>
+            <w:tcW w:type="dxa" w:w="785"/>
+          </w:tcPr>
+          <w:p>
+            <w:pPr>
+              <w:bidi/>
+              <w:jc w:val="center"/>
+            </w:pPr>
+            <w:r>
+              <w:rPr>
+                <w:rFonts w:ascii="Times New Roman" w:hAnsi="Times New Roman"/>
+                <w:sz w:val="20"/>
+              </w:rPr>
+              <w:t>۰.۰۰۱ &gt; p</w:t>
+            </w:r>
+          </w:p>
+        </w:tc>
+        <w:tc>
+          <w:tcPr>
+            <w:tcW w:type="dxa" w:w="785"/>
+          </w:tcPr>
+          <w:p>
+            <w:pPr>
+              <w:bidi/>
+              <w:jc w:val="center"/>
+            </w:pPr>
+            <w:r>
+              <w:rPr>
+                <w:rFonts w:ascii="Times New Roman" w:hAnsi="Times New Roman"/>
+                <w:sz w:val="20"/>
+              </w:rPr>
+              <w:t>۰.۶۴۴</w:t>
+            </w:r>
+          </w:p>
+        </w:tc>
+        <w:tc>
+          <w:tcPr>
+            <w:tcW w:type="dxa" w:w="785"/>
+          </w:tcPr>
+          <w:p>
+            <w:pPr>
+              <w:bidi/>
+              <w:jc w:val="center"/>
+            </w:pPr>
+            <w:r>
+              <w:rPr>
+                <w:rFonts w:ascii="Times New Roman" w:hAnsi="Times New Roman"/>
+                <w:sz w:val="20"/>
+              </w:rPr>
+              <w:t>0.415</w:t>
+            </w:r>
+          </w:p>
+        </w:tc>
+        <w:tc>
+          <w:tcPr>
+            <w:tcW w:type="dxa" w:w="785"/>
+          </w:tcPr>
+          <w:p>
+            <w:pPr>
+              <w:bidi/>
+              <w:jc w:val="center"/>
+            </w:pPr>
+            <w:r>
+              <w:rPr>
+                <w:rFonts w:ascii="Times New Roman" w:hAnsi="Times New Roman"/>
+                <w:sz w:val="20"/>
+              </w:rPr>
+              <w:t>۰.۴۰۳</w:t>
+            </w:r>
+          </w:p>
+        </w:tc>
+        <w:tc>
+          <w:tcPr>
+            <w:tcW w:type="dxa" w:w="785"/>
+          </w:tcPr>
+          <w:p>
+            <w:pPr>
+              <w:bidi/>
+              <w:jc w:val="center"/>
+            </w:pPr>
+            <w:r>
+              <w:rPr>
+                <w:rFonts w:ascii="Times New Roman" w:hAnsi="Times New Roman"/>
+                <w:sz w:val="20"/>
+              </w:rPr>
+              <w:t>۰.۵۲۲</w:t>
+            </w:r>
+          </w:p>
+        </w:tc>
+        <w:tc>
+          <w:tcPr>
+            <w:tcW w:type="dxa" w:w="785"/>
+          </w:tcPr>
+          <w:p>
+            <w:pPr>
+              <w:bidi/>
+              <w:jc w:val="center"/>
+            </w:pPr>
+            <w:r>
+              <w:rPr>
+                <w:rFonts w:ascii="Times New Roman" w:hAnsi="Times New Roman"/>
+                <w:sz w:val="20"/>
+              </w:rPr>
+              <w:t>۲.۱۱۵</w:t>
+            </w:r>
+          </w:p>
+        </w:tc>
+      </w:tr>
+      <w:tr>
+        <w:tc>
+          <w:tcPr>
+            <w:tcW w:type="dxa" w:w="785"/>
           </w:tcPr>
           <w:p>
             <w:pPr>
@@ -349,15 +1082,15 @@
             <w:r>
               <w:rPr>
                 <w:rFonts w:ascii="B Nazanin" w:hAnsi="B Nazanin"/>
-                <w:sz w:val="22"/>
+                <w:sz w:val="20"/>
               </w:rPr>
-              <w:t>—</w:t>
+              <w:t>باقی‌مانده</w:t>
             </w:r>
           </w:p>
         </w:tc>
         <w:tc>
           <w:tcPr>
-            <w:tcW w:type="dxa" w:w="1234"/>
+            <w:tcW w:type="dxa" w:w="785"/>
           </w:tcPr>
           <w:p>
             <w:pPr>
@@ -367,15 +1100,15 @@
             <w:r>
               <w:rPr>
                 <w:rFonts w:ascii="Times New Roman" w:hAnsi="Times New Roman"/>
-                <w:sz w:val="22"/>
+                <w:sz w:val="20"/>
               </w:rPr>
-              <w:t>۶.۵۷۴</w:t>
+              <w:t>۲۶.۳۸۵</w:t>
             </w:r>
           </w:p>
         </w:tc>
         <w:tc>
           <w:tcPr>
-            <w:tcW w:type="dxa" w:w="1234"/>
+            <w:tcW w:type="dxa" w:w="785"/>
           </w:tcPr>
           <w:p>
             <w:pPr>
@@ -385,15 +1118,33 @@
             <w:r>
               <w:rPr>
                 <w:rFonts w:ascii="Times New Roman" w:hAnsi="Times New Roman"/>
-                <w:sz w:val="22"/>
+                <w:sz w:val="20"/>
               </w:rPr>
-              <w:t>۰.۰۰۱ &gt; p</w:t>
+              <w:t>۹۷</w:t>
             </w:r>
           </w:p>
         </w:tc>
         <w:tc>
           <w:tcPr>
-            <w:tcW w:type="dxa" w:w="1234"/>
+            <w:tcW w:type="dxa" w:w="785"/>
+          </w:tcPr>
+          <w:p>
+            <w:pPr>
+              <w:bidi/>
+              <w:jc w:val="center"/>
+            </w:pPr>
+            <w:r>
+              <w:rPr>
+                <w:rFonts w:ascii="Times New Roman" w:hAnsi="Times New Roman"/>
+                <w:sz w:val="20"/>
+              </w:rPr>
+              <w:t>۰.۲۷۲</w:t>
+            </w:r>
+          </w:p>
+        </w:tc>
+        <w:tc>
+          <w:tcPr>
+            <w:tcW w:type="dxa" w:w="785"/>
           </w:tcPr>
           <w:p>
             <w:pPr>
@@ -403,7 +1154,115 @@
             <w:r>
               <w:rPr>
                 <w:rFonts w:ascii="B Nazanin" w:hAnsi="B Nazanin"/>
-                <w:sz w:val="22"/>
+                <w:sz w:val="20"/>
+              </w:rPr>
+              <w:t>—</w:t>
+            </w:r>
+          </w:p>
+        </w:tc>
+        <w:tc>
+          <w:tcPr>
+            <w:tcW w:type="dxa" w:w="785"/>
+          </w:tcPr>
+          <w:p>
+            <w:pPr>
+              <w:bidi/>
+              <w:jc w:val="center"/>
+            </w:pPr>
+            <w:r>
+              <w:rPr>
+                <w:rFonts w:ascii="B Nazanin" w:hAnsi="B Nazanin"/>
+                <w:sz w:val="20"/>
+              </w:rPr>
+              <w:t>—</w:t>
+            </w:r>
+          </w:p>
+        </w:tc>
+        <w:tc>
+          <w:tcPr>
+            <w:tcW w:type="dxa" w:w="785"/>
+          </w:tcPr>
+          <w:p>
+            <w:pPr>
+              <w:bidi/>
+              <w:jc w:val="center"/>
+            </w:pPr>
+            <w:r>
+              <w:rPr>
+                <w:rFonts w:ascii="B Nazanin" w:hAnsi="B Nazanin"/>
+                <w:sz w:val="20"/>
+              </w:rPr>
+              <w:t>—</w:t>
+            </w:r>
+          </w:p>
+        </w:tc>
+        <w:tc>
+          <w:tcPr>
+            <w:tcW w:type="dxa" w:w="785"/>
+          </w:tcPr>
+          <w:p>
+            <w:pPr>
+              <w:bidi/>
+              <w:jc w:val="center"/>
+            </w:pPr>
+            <w:r>
+              <w:rPr>
+                <w:rFonts w:ascii="B Nazanin" w:hAnsi="B Nazanin"/>
+                <w:sz w:val="20"/>
+              </w:rPr>
+              <w:t>—</w:t>
+            </w:r>
+          </w:p>
+        </w:tc>
+        <w:tc>
+          <w:tcPr>
+            <w:tcW w:type="dxa" w:w="785"/>
+          </w:tcPr>
+          <w:p>
+            <w:pPr>
+              <w:bidi/>
+              <w:jc w:val="center"/>
+            </w:pPr>
+            <w:r>
+              <w:rPr>
+                <w:rFonts w:ascii="B Nazanin" w:hAnsi="B Nazanin"/>
+                <w:sz w:val="20"/>
+              </w:rPr>
+              <w:t>—</w:t>
+            </w:r>
+          </w:p>
+        </w:tc>
+        <w:tc>
+          <w:tcPr>
+            <w:tcW w:type="dxa" w:w="785"/>
+          </w:tcPr>
+          <w:p>
+            <w:pPr>
+              <w:bidi/>
+              <w:jc w:val="center"/>
+            </w:pPr>
+            <w:r>
+              <w:rPr>
+                <w:rFonts w:ascii="B Nazanin" w:hAnsi="B Nazanin"/>
+                <w:sz w:val="20"/>
+              </w:rPr>
+              <w:t>—</w:t>
+            </w:r>
+          </w:p>
+        </w:tc>
+        <w:tc>
+          <w:tcPr>
+            <w:tcW w:type="dxa" w:w="785"/>
+          </w:tcPr>
+          <w:p>
+            <w:pPr>
+              <w:bidi/>
+              <w:jc w:val="center"/>
+            </w:pPr>
+            <w:r>
+              <w:rPr>
+                <w:rFonts w:ascii="B Nazanin" w:hAnsi="B Nazanin"/>
+                <w:sz w:val="20"/>
               </w:rPr>
               <w:t>—</w:t>
             </w:r>
@@ -413,7 +1272,7 @@
       <w:tr>
         <w:tc>
           <w:tcPr>
-            <w:tcW w:type="dxa" w:w="1234"/>
+            <w:tcW w:type="dxa" w:w="785"/>
           </w:tcPr>
           <w:p>
             <w:pPr>
@@ -423,15 +1282,15 @@
             <w:r>
               <w:rPr>
                 <w:rFonts w:ascii="B Nazanin" w:hAnsi="B Nazanin"/>
-                <w:sz w:val="22"/>
+                <w:sz w:val="20"/>
               </w:rPr>
-              <w:t>استرس شغلی</w:t>
+              <w:t>کل</w:t>
             </w:r>
           </w:p>
         </w:tc>
         <w:tc>
           <w:tcPr>
-            <w:tcW w:type="dxa" w:w="1234"/>
+            <w:tcW w:type="dxa" w:w="785"/>
           </w:tcPr>
           <w:p>
             <w:pPr>
@@ -441,15 +1300,15 @@
             <w:r>
               <w:rPr>
                 <w:rFonts w:ascii="Times New Roman" w:hAnsi="Times New Roman"/>
-                <w:sz w:val="22"/>
+                <w:sz w:val="20"/>
               </w:rPr>
-              <w:t>۰.۴۶۶</w:t>
+              <w:t>۴۵.۰۹۲</w:t>
             </w:r>
           </w:p>
         </w:tc>
         <w:tc>
           <w:tcPr>
-            <w:tcW w:type="dxa" w:w="1234"/>
+            <w:tcW w:type="dxa" w:w="785"/>
           </w:tcPr>
           <w:p>
             <w:pPr>
@@ -459,89 +1318,15 @@
             <w:r>
               <w:rPr>
                 <w:rFonts w:ascii="Times New Roman" w:hAnsi="Times New Roman"/>
-                <w:sz w:val="22"/>
+                <w:sz w:val="20"/>
               </w:rPr>
-              <w:t>۰.۰۸۱</w:t>
+              <w:t>۹۹</w:t>
             </w:r>
           </w:p>
         </w:tc>
         <w:tc>
           <w:tcPr>
-            <w:tcW w:type="dxa" w:w="1234"/>
-          </w:tcPr>
-          <w:p>
-            <w:pPr>
-              <w:bidi/>
-              <w:jc w:val="center"/>
-            </w:pPr>
-            <w:r>
-              <w:rPr>
-                <w:rFonts w:ascii="Times New Roman" w:hAnsi="Times New Roman"/>
-                <w:sz w:val="22"/>
-              </w:rPr>
-              <w:t>۰.۴۶۴</w:t>
-            </w:r>
-          </w:p>
-        </w:tc>
-        <w:tc>
-          <w:tcPr>
-            <w:tcW w:type="dxa" w:w="1234"/>
-          </w:tcPr>
-          <w:p>
-            <w:pPr>
-              <w:bidi/>
-              <w:jc w:val="center"/>
-            </w:pPr>
-            <w:r>
-              <w:rPr>
-                <w:rFonts w:ascii="Times New Roman" w:hAnsi="Times New Roman"/>
-                <w:sz w:val="22"/>
-              </w:rPr>
-              <w:t>۵.۷۵۶</w:t>
-            </w:r>
-          </w:p>
-        </w:tc>
-        <w:tc>
-          <w:tcPr>
-            <w:tcW w:type="dxa" w:w="1234"/>
-          </w:tcPr>
-          <w:p>
-            <w:pPr>
-              <w:bidi/>
-              <w:jc w:val="center"/>
-            </w:pPr>
-            <w:r>
-              <w:rPr>
-                <w:rFonts w:ascii="Times New Roman" w:hAnsi="Times New Roman"/>
-                <w:sz w:val="22"/>
-              </w:rPr>
-              <w:t>۰.۰۰۱ &gt; p</w:t>
-            </w:r>
-          </w:p>
-        </w:tc>
-        <w:tc>
-          <w:tcPr>
-            <w:tcW w:type="dxa" w:w="1234"/>
-          </w:tcPr>
-          <w:p>
-            <w:pPr>
-              <w:bidi/>
-              <w:jc w:val="center"/>
-            </w:pPr>
-            <w:r>
-              <w:rPr>
-                <w:rFonts w:ascii="Times New Roman" w:hAnsi="Times New Roman"/>
-                <w:sz w:val="22"/>
-              </w:rPr>
-              <w:t>۱.۰۹</w:t>
-            </w:r>
-          </w:p>
-        </w:tc>
-      </w:tr>
-      <w:tr>
-        <w:tc>
-          <w:tcPr>
-            <w:tcW w:type="dxa" w:w="1234"/>
+            <w:tcW w:type="dxa" w:w="785"/>
           </w:tcPr>
           <w:p>
             <w:pPr>
@@ -551,15 +1336,15 @@
             <w:r>
               <w:rPr>
                 <w:rFonts w:ascii="B Nazanin" w:hAnsi="B Nazanin"/>
-                <w:sz w:val="22"/>
+                <w:sz w:val="20"/>
               </w:rPr>
-              <w:t>انعطاف‌پذیری روان‌شناختی</w:t>
+              <w:t>—</w:t>
             </w:r>
           </w:p>
         </w:tc>
         <w:tc>
           <w:tcPr>
-            <w:tcW w:type="dxa" w:w="1234"/>
+            <w:tcW w:type="dxa" w:w="785"/>
           </w:tcPr>
           <w:p>
             <w:pPr>
@@ -568,16 +1353,16 @@
             </w:pPr>
             <w:r>
               <w:rPr>
-                <w:rFonts w:ascii="Times New Roman" w:hAnsi="Times New Roman"/>
-                <w:sz w:val="22"/>
+                <w:rFonts w:ascii="B Nazanin" w:hAnsi="B Nazanin"/>
+                <w:sz w:val="20"/>
               </w:rPr>
-              <w:t>۰.۳۶۲-</w:t>
+              <w:t>—</w:t>
             </w:r>
           </w:p>
         </w:tc>
         <w:tc>
           <w:tcPr>
-            <w:tcW w:type="dxa" w:w="1234"/>
+            <w:tcW w:type="dxa" w:w="785"/>
           </w:tcPr>
           <w:p>
             <w:pPr>
@@ -586,16 +1371,16 @@
             </w:pPr>
             <w:r>
               <w:rPr>
-                <w:rFonts w:ascii="Times New Roman" w:hAnsi="Times New Roman"/>
-                <w:sz w:val="22"/>
+                <w:rFonts w:ascii="B Nazanin" w:hAnsi="B Nazanin"/>
+                <w:sz w:val="20"/>
               </w:rPr>
-              <w:t>۰.۰۸۶</w:t>
+              <w:t>—</w:t>
             </w:r>
           </w:p>
         </w:tc>
         <w:tc>
           <w:tcPr>
-            <w:tcW w:type="dxa" w:w="1234"/>
+            <w:tcW w:type="dxa" w:w="785"/>
           </w:tcPr>
           <w:p>
             <w:pPr>
@@ -604,16 +1389,16 @@
             </w:pPr>
             <w:r>
               <w:rPr>
-                <w:rFonts w:ascii="Times New Roman" w:hAnsi="Times New Roman"/>
-                <w:sz w:val="22"/>
+                <w:rFonts w:ascii="B Nazanin" w:hAnsi="B Nazanin"/>
+                <w:sz w:val="20"/>
               </w:rPr>
-              <w:t>۰.۳۴۰-</w:t>
+              <w:t>—</w:t>
             </w:r>
           </w:p>
         </w:tc>
         <w:tc>
           <w:tcPr>
-            <w:tcW w:type="dxa" w:w="1234"/>
+            <w:tcW w:type="dxa" w:w="785"/>
           </w:tcPr>
           <w:p>
             <w:pPr>
@@ -622,16 +1407,16 @@
             </w:pPr>
             <w:r>
               <w:rPr>
-                <w:rFonts w:ascii="Times New Roman" w:hAnsi="Times New Roman"/>
-                <w:sz w:val="22"/>
+                <w:rFonts w:ascii="B Nazanin" w:hAnsi="B Nazanin"/>
+                <w:sz w:val="20"/>
               </w:rPr>
-              <w:t>۴.۲۲۴-</w:t>
+              <w:t>—</w:t>
             </w:r>
           </w:p>
         </w:tc>
         <w:tc>
           <w:tcPr>
-            <w:tcW w:type="dxa" w:w="1234"/>
+            <w:tcW w:type="dxa" w:w="785"/>
           </w:tcPr>
           <w:p>
             <w:pPr>
@@ -640,16 +1425,16 @@
             </w:pPr>
             <w:r>
               <w:rPr>
-                <w:rFonts w:ascii="Times New Roman" w:hAnsi="Times New Roman"/>
-                <w:sz w:val="22"/>
+                <w:rFonts w:ascii="B Nazanin" w:hAnsi="B Nazanin"/>
+                <w:sz w:val="20"/>
               </w:rPr>
-              <w:t>۰.۰۰۱ &gt; p</w:t>
+              <w:t>—</w:t>
             </w:r>
           </w:p>
         </w:tc>
         <w:tc>
           <w:tcPr>
-            <w:tcW w:type="dxa" w:w="1234"/>
+            <w:tcW w:type="dxa" w:w="785"/>
           </w:tcPr>
           <w:p>
             <w:pPr>
@@ -658,10 +1443,28 @@
             </w:pPr>
             <w:r>
               <w:rPr>
-                <w:rFonts w:ascii="Times New Roman" w:hAnsi="Times New Roman"/>
-                <w:sz w:val="22"/>
+                <w:rFonts w:ascii="B Nazanin" w:hAnsi="B Nazanin"/>
+                <w:sz w:val="20"/>
               </w:rPr>
-              <w:t>۱.۰۹</w:t>
+              <w:t>—</w:t>
+            </w:r>
+          </w:p>
+        </w:tc>
+        <w:tc>
+          <w:tcPr>
+            <w:tcW w:type="dxa" w:w="785"/>
+          </w:tcPr>
+          <w:p>
+            <w:pPr>
+              <w:bidi/>
+              <w:jc w:val="center"/>
+            </w:pPr>
+            <w:r>
+              <w:rPr>
+                <w:rFonts w:ascii="B Nazanin" w:hAnsi="B Nazanin"/>
+                <w:sz w:val="20"/>
+              </w:rPr>
+              <w:t>—</w:t>
             </w:r>
           </w:p>
         </w:tc>
@@ -678,23 +1481,7 @@
           <w:i/>
           <w:sz w:val="20"/>
         </w:rPr>
-        <w:t>یادداشت. متغیر ملاک: فرسودگی شغلی. شاخص‌های برازش الگو: 34.389 = (۹۷ ،۲)F، 0.415 = R²، 0.403 = تعدیل‌شده R²، ۰.۰۰۱ &gt; p.</w:t>
-      </w:r>
-    </w:p>
-    <w:p>
-      <w:pPr>
-        <w:bidi/>
-        <w:jc w:val="right"/>
-      </w:pPr>
-      <w:r>
-        <w:rPr>
-          <w:rFonts w:ascii="B Titr" w:hAnsi="B Titr"/>
-          <w:b/>
-          <w:sz w:val="26"/>
-          <w:rFonts w:ascii="B Titr" w:hAnsi="B Titr" w:cs="B Titr"/>
-          <w:rtl/>
-        </w:rPr>
-        <w:t>۴. تحلیل و تفسیر آماری</w:t>
+        <w:t>یادداشت. متغیر ملاک: فرسودگی شغلی. متغیرهای پیش‌بین: استرس شغلی، انعطاف‌پذیری روان‌شناختی.</w:t>
       </w:r>
     </w:p>
     <w:p>
@@ -711,7 +1498,23 @@
           <w:rFonts w:ascii="B Nazanin" w:hAnsi="B Nazanin" w:cs="B Nazanin"/>
           <w:rtl/>
         </w:rPr>
-        <w:t>بر اساس یافته‌های حاصل از آزمون تحلیل واریانس رگرسیون، مدل رگرسیونی ترسیم‌شده با اطمینان ۹۹ درصد معنادار است (34.389 = (۹۷ ،۲)F، ۰.۰۰۱ &gt; p). ضریب تعیین محاسبه‌شده نشان می‌دهد که ۴۱.۵ درصد از کل تغییرات و واریانس فرسودگی شغلی کارکنان (0.415 = R²) توسط متغیرهای استرس شغلی و انعطاف‌پذیری روان‌شناختی تبیین می‌گردد.</w:t>
+        <w:t>یافته‌های مندرج در جدول ۲ نشان می‌دهد که مدل رگرسیونی کلی با اطمینان ۹۹ درصد از لحاظ آماری معنادار است (34.389 = (۹۷ ،۲)F، ۰.۰۰۱ &gt; p). ضریب همبستگی چندگانه برابر با ۰.۶۴۴ و ضریب تعیین برابر با 0.415 به دست آمد؛ بدین معنا که ۴۱.۵ درصد از کل واریانس و تغییرات فرسودگی شغلی کارکنان توسط مجموعه متغیرهای استرس شغلی و انعطاف‌پذیری روان‌شناختی تبیین می‌گردد. مقدار آماره دوربین-واتسون (۲.۱۱۵) در دامنه مطلوب بین ۱.۵ تا ۲.۵ قرار دارد که حاکی از استقلال خطاهای برآورد و فقدان خودهمبستگی باقیمانده‌ها است.</w:t>
+      </w:r>
+    </w:p>
+    <w:p>
+      <w:pPr>
+        <w:bidi/>
+        <w:jc w:val="right"/>
+      </w:pPr>
+      <w:r>
+        <w:rPr>
+          <w:rFonts w:ascii="B Titr" w:hAnsi="B Titr"/>
+          <w:b/>
+          <w:sz w:val="26"/>
+          <w:rFonts w:ascii="B Titr" w:hAnsi="B Titr" w:cs="B Titr"/>
+          <w:rtl/>
+        </w:rPr>
+        <w:t>۴. ضرایب رگرسیون و شاخص‌های هم‌خطی</w:t>
       </w:r>
     </w:p>
     <w:p>
@@ -728,7 +1531,7 @@
           <w:rFonts w:ascii="B Nazanin" w:hAnsi="B Nazanin" w:cs="B Nazanin"/>
           <w:rtl/>
         </w:rPr>
-        <w:t>بررسی ضرایب استاندارد رگرسیون (β) نشان می‌دهد که متغیر استرس شغلی با ضریب استاندارد ۰.۴۶۴ و مقدار آماره ۵.۷۵۶ = t در سطح ۰.۰۰۱ &gt; p به صورت مثبت و معنادار قادر به پیش‌بینی فرسودگی شغلی است؛ بدین معنا که با افزایش یک انحراف استاندارد در میزان استرس شغلی، فرسودگی شغلی به میزان ۰.۴۶۴ انحراف استاندارد افزایش می‌یابد. همچنین، متغیر انعطاف‌پذیری روان‌شناختی با ضریب استاندارد ۰.۳۴۰- و مقدار آماره ۴.۲۲۴- = t در سطح ۰.۰۰۱ &gt; p به صورت منفی و معنادار فرسودگی شغلی را پیش‌بینی می‌نماید؛ بدین ترتیب، کارکنانی که از سطوح بالاتری از پذیرش و انعطاف‌پذیری در مواجهه با تجارب درونی دشوار برخوردارند، نشانه‌های فرسودگی شغلی کمتری را تجربه می‌کنند.</w:t>
+        <w:t>به منظور ارزیابی سهم اختصاصی هر یک از متغیرهای پیش‌بین در پیش‌بینی فرسودگی شغلی، ضرایب غیراستاندارد (B)، خطای معیار (SE)، ضرایب استاندارد (β)، مقدار آماره t، فاصله اطمینان ۹۵ درصد و شاخص‌های هم‌خطی (Tolerance و VIF) در جدول ۳ گزارش شده است.</w:t>
       </w:r>
     </w:p>
     <w:p>
@@ -738,13 +1541,709 @@
       </w:pPr>
       <w:r>
         <w:rPr>
-          <w:rFonts w:ascii="B Titr" w:hAnsi="B Titr"/>
+          <w:rFonts w:ascii="B Nazanin" w:hAnsi="B Nazanin"/>
           <w:b/>
-          <w:sz w:val="26"/>
-          <w:rFonts w:ascii="B Titr" w:hAnsi="B Titr" w:cs="B Titr"/>
-          <w:rtl/>
+          <w:sz w:val="22"/>
         </w:rPr>
-        <w:t>۵. نتیجه‌گیری آماری</w:t>
+        <w:t>جدول ۳. ضرایب رگرسیون چندگانه و شاخص‌های هم‌خطی متغیرهای پیش‌بین فرسودگی شغلی (۱۰۰ = N)</w:t>
+      </w:r>
+    </w:p>
+    <w:tbl>
+      <w:tblPr>
+        <w:tblW w:type="auto" w:w="0"/>
+        <w:jc w:val="center"/>
+        <w:tblLook w:firstColumn="1" w:firstRow="1" w:lastColumn="0" w:lastRow="0" w:noHBand="0" w:noVBand="1" w:val="04A0"/>
+        <w:bidiVisual/>
+      </w:tblPr>
+      <w:tblGrid>
+        <w:gridCol w:w="960"/>
+        <w:gridCol w:w="960"/>
+        <w:gridCol w:w="960"/>
+        <w:gridCol w:w="960"/>
+        <w:gridCol w:w="960"/>
+        <w:gridCol w:w="960"/>
+        <w:gridCol w:w="960"/>
+        <w:gridCol w:w="960"/>
+        <w:gridCol w:w="960"/>
+      </w:tblGrid>
+      <w:tr>
+        <w:tc>
+          <w:tcPr>
+            <w:tcW w:type="dxa" w:w="960"/>
+          </w:tcPr>
+          <w:p>
+            <w:pPr>
+              <w:bidi/>
+              <w:jc w:val="center"/>
+            </w:pPr>
+            <w:r>
+              <w:rPr>
+                <w:rFonts w:ascii="B Nazanin" w:hAnsi="B Nazanin"/>
+                <w:b/>
+                <w:sz w:val="20"/>
+              </w:rPr>
+              <w:t>متغیرهای مدل</w:t>
+            </w:r>
+          </w:p>
+        </w:tc>
+        <w:tc>
+          <w:tcPr>
+            <w:tcW w:type="dxa" w:w="960"/>
+          </w:tcPr>
+          <w:p>
+            <w:pPr>
+              <w:bidi/>
+              <w:jc w:val="center"/>
+            </w:pPr>
+            <w:r>
+              <w:rPr>
+                <w:rFonts w:ascii="B Nazanin" w:hAnsi="B Nazanin"/>
+                <w:b/>
+                <w:sz w:val="20"/>
+              </w:rPr>
+              <w:t>B</w:t>
+            </w:r>
+          </w:p>
+        </w:tc>
+        <w:tc>
+          <w:tcPr>
+            <w:tcW w:type="dxa" w:w="960"/>
+          </w:tcPr>
+          <w:p>
+            <w:pPr>
+              <w:bidi/>
+              <w:jc w:val="center"/>
+            </w:pPr>
+            <w:r>
+              <w:rPr>
+                <w:rFonts w:ascii="B Nazanin" w:hAnsi="B Nazanin"/>
+                <w:b/>
+                <w:sz w:val="20"/>
+              </w:rPr>
+              <w:t>SE</w:t>
+            </w:r>
+          </w:p>
+        </w:tc>
+        <w:tc>
+          <w:tcPr>
+            <w:tcW w:type="dxa" w:w="960"/>
+          </w:tcPr>
+          <w:p>
+            <w:pPr>
+              <w:bidi/>
+              <w:jc w:val="center"/>
+            </w:pPr>
+            <w:r>
+              <w:rPr>
+                <w:rFonts w:ascii="B Nazanin" w:hAnsi="B Nazanin"/>
+                <w:b/>
+                <w:sz w:val="20"/>
+              </w:rPr>
+              <w:t>β</w:t>
+            </w:r>
+          </w:p>
+        </w:tc>
+        <w:tc>
+          <w:tcPr>
+            <w:tcW w:type="dxa" w:w="960"/>
+          </w:tcPr>
+          <w:p>
+            <w:pPr>
+              <w:bidi/>
+              <w:jc w:val="center"/>
+            </w:pPr>
+            <w:r>
+              <w:rPr>
+                <w:rFonts w:ascii="B Nazanin" w:hAnsi="B Nazanin"/>
+                <w:b/>
+                <w:sz w:val="20"/>
+              </w:rPr>
+              <w:t>t</w:t>
+            </w:r>
+          </w:p>
+        </w:tc>
+        <w:tc>
+          <w:tcPr>
+            <w:tcW w:type="dxa" w:w="960"/>
+          </w:tcPr>
+          <w:p>
+            <w:pPr>
+              <w:bidi/>
+              <w:jc w:val="center"/>
+            </w:pPr>
+            <w:r>
+              <w:rPr>
+                <w:rFonts w:ascii="B Nazanin" w:hAnsi="B Nazanin"/>
+                <w:b/>
+                <w:sz w:val="20"/>
+              </w:rPr>
+              <w:t>سطح معناداری (p)</w:t>
+            </w:r>
+          </w:p>
+        </w:tc>
+        <w:tc>
+          <w:tcPr>
+            <w:tcW w:type="dxa" w:w="960"/>
+          </w:tcPr>
+          <w:p>
+            <w:pPr>
+              <w:bidi/>
+              <w:jc w:val="center"/>
+            </w:pPr>
+            <w:r>
+              <w:rPr>
+                <w:rFonts w:ascii="B Nazanin" w:hAnsi="B Nazanin"/>
+                <w:b/>
+                <w:sz w:val="20"/>
+              </w:rPr>
+              <w:t>فاصله اطمینان ۹۵٪</w:t>
+            </w:r>
+          </w:p>
+        </w:tc>
+        <w:tc>
+          <w:tcPr>
+            <w:tcW w:type="dxa" w:w="960"/>
+          </w:tcPr>
+          <w:p>
+            <w:pPr>
+              <w:bidi/>
+              <w:jc w:val="center"/>
+            </w:pPr>
+            <w:r>
+              <w:rPr>
+                <w:rFonts w:ascii="B Nazanin" w:hAnsi="B Nazanin"/>
+                <w:b/>
+                <w:sz w:val="20"/>
+              </w:rPr>
+              <w:t>تولرانس</w:t>
+            </w:r>
+          </w:p>
+        </w:tc>
+        <w:tc>
+          <w:tcPr>
+            <w:tcW w:type="dxa" w:w="960"/>
+          </w:tcPr>
+          <w:p>
+            <w:pPr>
+              <w:bidi/>
+              <w:jc w:val="center"/>
+            </w:pPr>
+            <w:r>
+              <w:rPr>
+                <w:rFonts w:ascii="B Nazanin" w:hAnsi="B Nazanin"/>
+                <w:b/>
+                <w:sz w:val="20"/>
+              </w:rPr>
+              <w:t>VIF</w:t>
+            </w:r>
+          </w:p>
+        </w:tc>
+      </w:tr>
+      <w:tr>
+        <w:tc>
+          <w:tcPr>
+            <w:tcW w:type="dxa" w:w="960"/>
+          </w:tcPr>
+          <w:p>
+            <w:pPr>
+              <w:bidi/>
+              <w:jc w:val="center"/>
+            </w:pPr>
+            <w:r>
+              <w:rPr>
+                <w:rFonts w:ascii="B Nazanin" w:hAnsi="B Nazanin"/>
+                <w:sz w:val="20"/>
+              </w:rPr>
+              <w:t>مقدار ثابت</w:t>
+            </w:r>
+          </w:p>
+        </w:tc>
+        <w:tc>
+          <w:tcPr>
+            <w:tcW w:type="dxa" w:w="960"/>
+          </w:tcPr>
+          <w:p>
+            <w:pPr>
+              <w:bidi/>
+              <w:jc w:val="center"/>
+            </w:pPr>
+            <w:r>
+              <w:rPr>
+                <w:rFonts w:ascii="Times New Roman" w:hAnsi="Times New Roman"/>
+                <w:sz w:val="20"/>
+              </w:rPr>
+              <w:t>۲.۸۲۴</w:t>
+            </w:r>
+          </w:p>
+        </w:tc>
+        <w:tc>
+          <w:tcPr>
+            <w:tcW w:type="dxa" w:w="960"/>
+          </w:tcPr>
+          <w:p>
+            <w:pPr>
+              <w:bidi/>
+              <w:jc w:val="center"/>
+            </w:pPr>
+            <w:r>
+              <w:rPr>
+                <w:rFonts w:ascii="Times New Roman" w:hAnsi="Times New Roman"/>
+                <w:sz w:val="20"/>
+              </w:rPr>
+              <w:t>۰.۴۴۹</w:t>
+            </w:r>
+          </w:p>
+        </w:tc>
+        <w:tc>
+          <w:tcPr>
+            <w:tcW w:type="dxa" w:w="960"/>
+          </w:tcPr>
+          <w:p>
+            <w:pPr>
+              <w:bidi/>
+              <w:jc w:val="center"/>
+            </w:pPr>
+            <w:r>
+              <w:rPr>
+                <w:rFonts w:ascii="B Nazanin" w:hAnsi="B Nazanin"/>
+                <w:sz w:val="20"/>
+              </w:rPr>
+              <w:t>—</w:t>
+            </w:r>
+          </w:p>
+        </w:tc>
+        <w:tc>
+          <w:tcPr>
+            <w:tcW w:type="dxa" w:w="960"/>
+          </w:tcPr>
+          <w:p>
+            <w:pPr>
+              <w:bidi/>
+              <w:jc w:val="center"/>
+            </w:pPr>
+            <w:r>
+              <w:rPr>
+                <w:rFonts w:ascii="Times New Roman" w:hAnsi="Times New Roman"/>
+                <w:sz w:val="20"/>
+              </w:rPr>
+              <w:t>۶.۲۸۹</w:t>
+            </w:r>
+          </w:p>
+        </w:tc>
+        <w:tc>
+          <w:tcPr>
+            <w:tcW w:type="dxa" w:w="960"/>
+          </w:tcPr>
+          <w:p>
+            <w:pPr>
+              <w:bidi/>
+              <w:jc w:val="center"/>
+            </w:pPr>
+            <w:r>
+              <w:rPr>
+                <w:rFonts w:ascii="Times New Roman" w:hAnsi="Times New Roman"/>
+                <w:sz w:val="20"/>
+              </w:rPr>
+              <w:t>۰.۰۰۱ &gt; p</w:t>
+            </w:r>
+          </w:p>
+        </w:tc>
+        <w:tc>
+          <w:tcPr>
+            <w:tcW w:type="dxa" w:w="960"/>
+          </w:tcPr>
+          <w:p>
+            <w:pPr>
+              <w:bidi/>
+              <w:jc w:val="center"/>
+            </w:pPr>
+            <w:r>
+              <w:rPr>
+                <w:rFonts w:ascii="Times New Roman" w:hAnsi="Times New Roman"/>
+                <w:sz w:val="20"/>
+              </w:rPr>
+              <w:t>[۱.۹۳۳ ، ۳.۷۱۵]</w:t>
+            </w:r>
+          </w:p>
+        </w:tc>
+        <w:tc>
+          <w:tcPr>
+            <w:tcW w:type="dxa" w:w="960"/>
+          </w:tcPr>
+          <w:p>
+            <w:pPr>
+              <w:bidi/>
+              <w:jc w:val="center"/>
+            </w:pPr>
+            <w:r>
+              <w:rPr>
+                <w:rFonts w:ascii="B Nazanin" w:hAnsi="B Nazanin"/>
+                <w:sz w:val="20"/>
+              </w:rPr>
+              <w:t>—</w:t>
+            </w:r>
+          </w:p>
+        </w:tc>
+        <w:tc>
+          <w:tcPr>
+            <w:tcW w:type="dxa" w:w="960"/>
+          </w:tcPr>
+          <w:p>
+            <w:pPr>
+              <w:bidi/>
+              <w:jc w:val="center"/>
+            </w:pPr>
+            <w:r>
+              <w:rPr>
+                <w:rFonts w:ascii="B Nazanin" w:hAnsi="B Nazanin"/>
+                <w:sz w:val="20"/>
+              </w:rPr>
+              <w:t>—</w:t>
+            </w:r>
+          </w:p>
+        </w:tc>
+      </w:tr>
+      <w:tr>
+        <w:tc>
+          <w:tcPr>
+            <w:tcW w:type="dxa" w:w="960"/>
+          </w:tcPr>
+          <w:p>
+            <w:pPr>
+              <w:bidi/>
+              <w:jc w:val="center"/>
+            </w:pPr>
+            <w:r>
+              <w:rPr>
+                <w:rFonts w:ascii="B Nazanin" w:hAnsi="B Nazanin"/>
+                <w:sz w:val="20"/>
+              </w:rPr>
+              <w:t>استرس شغلی</w:t>
+            </w:r>
+          </w:p>
+        </w:tc>
+        <w:tc>
+          <w:tcPr>
+            <w:tcW w:type="dxa" w:w="960"/>
+          </w:tcPr>
+          <w:p>
+            <w:pPr>
+              <w:bidi/>
+              <w:jc w:val="center"/>
+            </w:pPr>
+            <w:r>
+              <w:rPr>
+                <w:rFonts w:ascii="Times New Roman" w:hAnsi="Times New Roman"/>
+                <w:sz w:val="20"/>
+              </w:rPr>
+              <w:t>۰.۴۶۶</w:t>
+            </w:r>
+          </w:p>
+        </w:tc>
+        <w:tc>
+          <w:tcPr>
+            <w:tcW w:type="dxa" w:w="960"/>
+          </w:tcPr>
+          <w:p>
+            <w:pPr>
+              <w:bidi/>
+              <w:jc w:val="center"/>
+            </w:pPr>
+            <w:r>
+              <w:rPr>
+                <w:rFonts w:ascii="Times New Roman" w:hAnsi="Times New Roman"/>
+                <w:sz w:val="20"/>
+              </w:rPr>
+              <w:t>۰.۰۸۱</w:t>
+            </w:r>
+          </w:p>
+        </w:tc>
+        <w:tc>
+          <w:tcPr>
+            <w:tcW w:type="dxa" w:w="960"/>
+          </w:tcPr>
+          <w:p>
+            <w:pPr>
+              <w:bidi/>
+              <w:jc w:val="center"/>
+            </w:pPr>
+            <w:r>
+              <w:rPr>
+                <w:rFonts w:ascii="Times New Roman" w:hAnsi="Times New Roman"/>
+                <w:sz w:val="20"/>
+              </w:rPr>
+              <w:t>۰.۴۶۴</w:t>
+            </w:r>
+          </w:p>
+        </w:tc>
+        <w:tc>
+          <w:tcPr>
+            <w:tcW w:type="dxa" w:w="960"/>
+          </w:tcPr>
+          <w:p>
+            <w:pPr>
+              <w:bidi/>
+              <w:jc w:val="center"/>
+            </w:pPr>
+            <w:r>
+              <w:rPr>
+                <w:rFonts w:ascii="Times New Roman" w:hAnsi="Times New Roman"/>
+                <w:sz w:val="20"/>
+              </w:rPr>
+              <w:t>۵.۷۵۶</w:t>
+            </w:r>
+          </w:p>
+        </w:tc>
+        <w:tc>
+          <w:tcPr>
+            <w:tcW w:type="dxa" w:w="960"/>
+          </w:tcPr>
+          <w:p>
+            <w:pPr>
+              <w:bidi/>
+              <w:jc w:val="center"/>
+            </w:pPr>
+            <w:r>
+              <w:rPr>
+                <w:rFonts w:ascii="Times New Roman" w:hAnsi="Times New Roman"/>
+                <w:sz w:val="20"/>
+              </w:rPr>
+              <w:t>۰.۰۰۱ &gt; p</w:t>
+            </w:r>
+          </w:p>
+        </w:tc>
+        <w:tc>
+          <w:tcPr>
+            <w:tcW w:type="dxa" w:w="960"/>
+          </w:tcPr>
+          <w:p>
+            <w:pPr>
+              <w:bidi/>
+              <w:jc w:val="center"/>
+            </w:pPr>
+            <w:r>
+              <w:rPr>
+                <w:rFonts w:ascii="Times New Roman" w:hAnsi="Times New Roman"/>
+                <w:sz w:val="20"/>
+              </w:rPr>
+              <w:t>[۰.۳۰۵ ، ۰.۶۲۷]</w:t>
+            </w:r>
+          </w:p>
+        </w:tc>
+        <w:tc>
+          <w:tcPr>
+            <w:tcW w:type="dxa" w:w="960"/>
+          </w:tcPr>
+          <w:p>
+            <w:pPr>
+              <w:bidi/>
+              <w:jc w:val="center"/>
+            </w:pPr>
+            <w:r>
+              <w:rPr>
+                <w:rFonts w:ascii="Times New Roman" w:hAnsi="Times New Roman"/>
+                <w:sz w:val="20"/>
+              </w:rPr>
+              <w:t>۰.۹۲۹</w:t>
+            </w:r>
+          </w:p>
+        </w:tc>
+        <w:tc>
+          <w:tcPr>
+            <w:tcW w:type="dxa" w:w="960"/>
+          </w:tcPr>
+          <w:p>
+            <w:pPr>
+              <w:bidi/>
+              <w:jc w:val="center"/>
+            </w:pPr>
+            <w:r>
+              <w:rPr>
+                <w:rFonts w:ascii="Times New Roman" w:hAnsi="Times New Roman"/>
+                <w:sz w:val="20"/>
+              </w:rPr>
+              <w:t>۱.۰۷۶</w:t>
+            </w:r>
+          </w:p>
+        </w:tc>
+      </w:tr>
+      <w:tr>
+        <w:tc>
+          <w:tcPr>
+            <w:tcW w:type="dxa" w:w="960"/>
+          </w:tcPr>
+          <w:p>
+            <w:pPr>
+              <w:bidi/>
+              <w:jc w:val="center"/>
+            </w:pPr>
+            <w:r>
+              <w:rPr>
+                <w:rFonts w:ascii="B Nazanin" w:hAnsi="B Nazanin"/>
+                <w:sz w:val="20"/>
+              </w:rPr>
+              <w:t>انعطاف‌پذیری روان‌شناختی</w:t>
+            </w:r>
+          </w:p>
+        </w:tc>
+        <w:tc>
+          <w:tcPr>
+            <w:tcW w:type="dxa" w:w="960"/>
+          </w:tcPr>
+          <w:p>
+            <w:pPr>
+              <w:bidi/>
+              <w:jc w:val="center"/>
+            </w:pPr>
+            <w:r>
+              <w:rPr>
+                <w:rFonts w:ascii="Times New Roman" w:hAnsi="Times New Roman"/>
+                <w:sz w:val="20"/>
+              </w:rPr>
+              <w:t>۰.۳۶۲-</w:t>
+            </w:r>
+          </w:p>
+        </w:tc>
+        <w:tc>
+          <w:tcPr>
+            <w:tcW w:type="dxa" w:w="960"/>
+          </w:tcPr>
+          <w:p>
+            <w:pPr>
+              <w:bidi/>
+              <w:jc w:val="center"/>
+            </w:pPr>
+            <w:r>
+              <w:rPr>
+                <w:rFonts w:ascii="Times New Roman" w:hAnsi="Times New Roman"/>
+                <w:sz w:val="20"/>
+              </w:rPr>
+              <w:t>۰.۰۸۶</w:t>
+            </w:r>
+          </w:p>
+        </w:tc>
+        <w:tc>
+          <w:tcPr>
+            <w:tcW w:type="dxa" w:w="960"/>
+          </w:tcPr>
+          <w:p>
+            <w:pPr>
+              <w:bidi/>
+              <w:jc w:val="center"/>
+            </w:pPr>
+            <w:r>
+              <w:rPr>
+                <w:rFonts w:ascii="Times New Roman" w:hAnsi="Times New Roman"/>
+                <w:sz w:val="20"/>
+              </w:rPr>
+              <w:t>۰.۳۴۰-</w:t>
+            </w:r>
+          </w:p>
+        </w:tc>
+        <w:tc>
+          <w:tcPr>
+            <w:tcW w:type="dxa" w:w="960"/>
+          </w:tcPr>
+          <w:p>
+            <w:pPr>
+              <w:bidi/>
+              <w:jc w:val="center"/>
+            </w:pPr>
+            <w:r>
+              <w:rPr>
+                <w:rFonts w:ascii="Times New Roman" w:hAnsi="Times New Roman"/>
+                <w:sz w:val="20"/>
+              </w:rPr>
+              <w:t>۴.۲۲۴-</w:t>
+            </w:r>
+          </w:p>
+        </w:tc>
+        <w:tc>
+          <w:tcPr>
+            <w:tcW w:type="dxa" w:w="960"/>
+          </w:tcPr>
+          <w:p>
+            <w:pPr>
+              <w:bidi/>
+              <w:jc w:val="center"/>
+            </w:pPr>
+            <w:r>
+              <w:rPr>
+                <w:rFonts w:ascii="Times New Roman" w:hAnsi="Times New Roman"/>
+                <w:sz w:val="20"/>
+              </w:rPr>
+              <w:t>۰.۰۰۱ &gt; p</w:t>
+            </w:r>
+          </w:p>
+        </w:tc>
+        <w:tc>
+          <w:tcPr>
+            <w:tcW w:type="dxa" w:w="960"/>
+          </w:tcPr>
+          <w:p>
+            <w:pPr>
+              <w:bidi/>
+              <w:jc w:val="center"/>
+            </w:pPr>
+            <w:r>
+              <w:rPr>
+                <w:rFonts w:ascii="Times New Roman" w:hAnsi="Times New Roman"/>
+                <w:sz w:val="20"/>
+              </w:rPr>
+              <w:t>[۰.۵۳۲- ، ۰.۱۹۲-]</w:t>
+            </w:r>
+          </w:p>
+        </w:tc>
+        <w:tc>
+          <w:tcPr>
+            <w:tcW w:type="dxa" w:w="960"/>
+          </w:tcPr>
+          <w:p>
+            <w:pPr>
+              <w:bidi/>
+              <w:jc w:val="center"/>
+            </w:pPr>
+            <w:r>
+              <w:rPr>
+                <w:rFonts w:ascii="Times New Roman" w:hAnsi="Times New Roman"/>
+                <w:sz w:val="20"/>
+              </w:rPr>
+              <w:t>۰.۹۲۹</w:t>
+            </w:r>
+          </w:p>
+        </w:tc>
+        <w:tc>
+          <w:tcPr>
+            <w:tcW w:type="dxa" w:w="960"/>
+          </w:tcPr>
+          <w:p>
+            <w:pPr>
+              <w:bidi/>
+              <w:jc w:val="center"/>
+            </w:pPr>
+            <w:r>
+              <w:rPr>
+                <w:rFonts w:ascii="Times New Roman" w:hAnsi="Times New Roman"/>
+                <w:sz w:val="20"/>
+              </w:rPr>
+              <w:t>۱.۰۷۶</w:t>
+            </w:r>
+          </w:p>
+        </w:tc>
+      </w:tr>
+    </w:tbl>
+    <w:p>
+      <w:pPr>
+        <w:bidi/>
+        <w:jc w:val="both"/>
+      </w:pPr>
+      <w:r>
+        <w:rPr>
+          <w:rFonts w:ascii="B Nazanin" w:hAnsi="B Nazanin"/>
+          <w:i/>
+          <w:sz w:val="20"/>
+        </w:rPr>
+        <w:t>یادداشت. متغیر ملاک: فرسودگی شغلی.</w:t>
       </w:r>
     </w:p>
     <w:p>
@@ -761,7 +2260,40 @@
           <w:rFonts w:ascii="B Nazanin" w:hAnsi="B Nazanin" w:cs="B Nazanin"/>
           <w:rtl/>
         </w:rPr>
-        <w:t>با عنایت به معناداری کلی مدل رگرسیونی و معناداری انفرادی ضرایب هر دو متغیر در جهت مورد انتظار، فرضیه اول پژوهش تأیید می‌گردد.</w:t>
+        <w:t>نتایج جدول ۳ نشان می‌دهد که استرس شغلی با ضریب استاندارد ۰.۴۶۴ و آماره ۵.۷۵۶ = t در سطح ۰.۰۰۱ &gt; p به صورت مثبت و معنادار فرسودگی شغلی را پیش‌بینی می‌کند. همچنین انعطاف‌پذیری روان‌شناختی با ضریب استاندارد ۰.۳۴۰- و آماره ۴.۲۲۴- = t در سطح ۰.۰۰۱ &gt; p به صورت منفی و معنادار قادر به پیش‌بینی فرسودگی شغلی است. شاخص‌های تولرانس (۰.۹۲۹) و VIF (۱.۰۷۶) برای هر دو متغیر در وضعیت کاملاً بهنجار قرار داشته و عدم وجود هم‌خطی چندگانه را تصدیق می‌نمایند.</w:t>
+      </w:r>
+    </w:p>
+    <w:p>
+      <w:pPr>
+        <w:bidi/>
+        <w:jc w:val="right"/>
+      </w:pPr>
+      <w:r>
+        <w:rPr>
+          <w:rFonts w:ascii="B Titr" w:hAnsi="B Titr"/>
+          <w:b/>
+          <w:sz w:val="26"/>
+          <w:rFonts w:ascii="B Titr" w:hAnsi="B Titr" w:cs="B Titr"/>
+          <w:rtl/>
+        </w:rPr>
+        <w:t>۵. نتیجه‌گیری آماری فرضیه</w:t>
+      </w:r>
+    </w:p>
+    <w:p>
+      <w:pPr>
+        <w:bidi/>
+        <w:jc w:val="both"/>
+      </w:pPr>
+      <w:r>
+        <w:rPr>
+          <w:rFonts w:ascii="B Nazanin" w:hAnsi="B Nazanin"/>
+          <w:b w:val="0"/>
+          <w:i w:val="0"/>
+          <w:sz w:val="26"/>
+          <w:rFonts w:ascii="B Nazanin" w:hAnsi="B Nazanin" w:cs="B Nazanin"/>
+          <w:rtl/>
+        </w:rPr>
+        <w:t>با توجه به معناداری کلی مدل رگرسیون در جدول تحلیل واریانس و معناداری انفرادی ضرایب رگرسیون استاندارد در جهت مورد انتظار، فرضیه اول پژوهش مبنی بر پیش‌بینی معنادار فرسودگی شغلی توسط استرس شغلی و انعطاف‌پذیری روان‌شناختی با اطمینان ۹۹ درصد تأیید می‌گردد.</w:t>
       </w:r>
     </w:p>
     <w:sectPr>

</xml_diff>